<commit_message>
Corrige el solapamiento de la encuesta sociodemográfica.
Reconstruye el cuestionario en tabla de dos columnas limpias y aplica la reparación al generar desde la plantilla.
</commit_message>
<xml_diff>
--- a/plantillas/GESTIÓN DOCUMENTAL SST -20260720T165501Z-1-001/GESTIÓN DOCUMENTAL SST_/2 HACER_/1 Perfil sociodemografico/Encuesta perfil sociodemografico/FG-FOR-SST-39 - ENCUESTA PERFIL SOCIODEMOGRAFICO Y MORBILIDAD SENTIDA.docx
+++ b/plantillas/GESTIÓN DOCUMENTAL SST -20260720T165501Z-1-001/GESTIÓN DOCUMENTAL SST_/2 HACER_/1 Perfil sociodemografico/Encuesta perfil sociodemografico/FG-FOR-SST-39 - ENCUESTA PERFIL SOCIODEMOGRAFICO Y MORBILIDAD SENTIDA.docx
@@ -77,116 +77,1387 @@
             </w:tcBorders>
           </w:tcPr>
           <w:p>
+            <w:r/>
             <w:r>
-              <w:t>NOMBRE:____________________________________________________________</w:t>
-              <w:br/>
-              <w:t>CARGO:  ____________________________________________________________</w:t>
-              <w:br/>
+              <w:rPr>
+                <w:sz w:val="20"/>
+              </w:rPr>
+              <w:t>NOMBRE: ________________________________________________</w:t>
+            </w:r>
+          </w:p>
+          <w:p>
+            <w:r>
+              <w:rPr>
+                <w:sz w:val="20"/>
+              </w:rPr>
+              <w:t>CARGO:  ________________________________________________</w:t>
+            </w:r>
+          </w:p>
+          <w:p>
+            <w:r>
+              <w:rPr>
+                <w:sz w:val="20"/>
+              </w:rPr>
               <w:t>Fecha: 02/02/2026</w:t>
-              <w:br/>
+            </w:r>
+          </w:p>
+          <w:p>
+            <w:r>
+              <w:rPr>
+                <w:b/>
+                <w:sz w:val="20"/>
+              </w:rPr>
               <w:t>Marque con una X:</w:t>
-              <w:br/>
-              <w:t xml:space="preserve">1. EDAD                                                              2. ESTADO CIVIL                   </w:t>
-              <w:br/>
-              <w:t>a. 18 – 25 años                                                   a.  Soltero (a)</w:t>
-              <w:br/>
-              <w:t>b. 26 – 35 años                                                   b.  Unión libre</w:t>
-              <w:br/>
-              <w:t>c. 36 _ 45 años                                                   c.  Casado (a)</w:t>
-              <w:br/>
-              <w:t>d. 46 años o más                                                d.  Divorciado (a)</w:t>
-              <w:br/>
-              <w:t>3. SEXO                                                            4. NÚMERO DE PERSONAS A CARGO</w:t>
-              <w:br/>
-              <w:t>a. Hombre                                                         a. Ninguna</w:t>
-              <w:br/>
-              <w:t>b. Mujer                                                             b. 1 – 3 personas</w:t>
-              <w:br/>
-              <w:t>c. No binario                                                      c. 4 – 6 personas</w:t>
-              <w:br/>
-              <w:t xml:space="preserve">                                                                          d. Más de 6 personas</w:t>
-              <w:br/>
-              <w:t>5. NIVEL DE ESCOLARIDAD                           6. TENENCIA DE VIVIENDA</w:t>
-              <w:br/>
-              <w:t>a. Primaria                                                          a. Propia</w:t>
-              <w:br/>
-              <w:t>b. Secundaria                                                     b. Arrendada</w:t>
-              <w:br/>
-              <w:t>c. Técnico / Tecnólogo                                       c. Familiar</w:t>
-              <w:br/>
-              <w:t>d. Universitario                                                   d. Compartida con otra(s) familia(s)</w:t>
-              <w:br/>
-              <w:t>e. Ninguna</w:t>
-              <w:br/>
-              <w:t>7. USO DEL TIEMPO LIBRE                               8. PROMEDIO DE INGRESOS (S.M.L.)</w:t>
-              <w:br/>
-              <w:t>a. Otro trabajo                                                      a. Mínimo Legal (S.M.L.)</w:t>
-              <w:br/>
-              <w:t>b. Labores domésticas                                         b. Entre 1 a 2 S.M.L.</w:t>
-              <w:br/>
-              <w:t>c. Recreación y deporte                                       c.  Entre 3 a 4 S.M.L.</w:t>
-              <w:br/>
-              <w:t>d. Estudio                                                             d. Más de 5 S.M.L.</w:t>
-              <w:br/>
-              <w:t xml:space="preserve">e. Ninguno                                                            </w:t>
-              <w:br/>
-              <w:t>9. ANTIGÜEDAD EN LA EMPRESA                    10. ANTIGÜEDAD EN EL CARGO ACTUAL</w:t>
-              <w:br/>
-              <w:t xml:space="preserve">a. Menos de 1 mes                                                a. Menos de 1 mes                                                </w:t>
-              <w:br/>
-              <w:t xml:space="preserve">b. De 1 a 6 meses                                                  b. De 1 a 6 meses                                                  </w:t>
-              <w:br/>
-              <w:t xml:space="preserve">c. De 7 a 11 meses                                                c. De 7 a 11 meses                                                </w:t>
-              <w:br/>
-              <w:t xml:space="preserve">d. De 1 a 2 años                                                    d. De 1 a 2 años                                                    </w:t>
-              <w:br/>
-              <w:t xml:space="preserve">e. Más de 2 años                                                   e. Más de 2 años                                                   </w:t>
-              <w:br/>
-              <w:t>11. HA PARTICIPADO EN ACTIVIDADES DE    12. LE HAN DIAGNOSTICADO ALGUNA ENFERMEDAD</w:t>
-              <w:br/>
-              <w:t xml:space="preserve"> SALUD REALIZADAS POR LA EMPRESA      a. Si </w:t>
-              <w:br/>
-              <w:t>a. Vacunación                                                       b. No</w:t>
-              <w:br/>
-              <w:t>b. Salud Oral                                                         Cual: ______________________________________</w:t>
-              <w:br/>
-              <w:t>c. Exámenes de laboratorio y otros</w:t>
-              <w:br/>
-              <w:t>d. Exámenes médicos anuales</w:t>
-              <w:br/>
-              <w:t>e. Ninguna</w:t>
-              <w:br/>
-              <w:t>13. CONSUME BEBIDAS ALCOHOLICAS         14. PRACTICA ALGÚN DEPORTE</w:t>
-              <w:br/>
-              <w:t xml:space="preserve">                           Frecuencia</w:t>
-              <w:br/>
-              <w:t>a. Si                    ___ Semanal                              a. Si</w:t>
-              <w:br/>
-              <w:t>b. No                   ___ Quincenal                            b. No</w:t>
-              <w:br/>
-              <w:t xml:space="preserve">                            ___ Mensual                              Cual _______________________________________</w:t>
-              <w:br/>
-              <w:t xml:space="preserve">                            ___ Ocasional                       </w:t>
-              <w:br/>
-              <w:t xml:space="preserve">                                                                              Frecuencia ___________________________________</w:t>
-              <w:br/>
-              <w:t>15. FUMA</w:t>
-              <w:br/>
-              <w:t>a. Si                                                                       Promedio: _____________________________________</w:t>
-              <w:br/>
-              <w:t>b. No</w:t>
-              <w:br/>
-              <w:br/>
-              <w:t>16. CONSUME SUSTANCIAS TÓXICAS      17. CONSUME MEDICAMENTOS</w:t>
-              <w:br/>
-              <w:t>a. si                                                                      a. si</w:t>
-              <w:br/>
-              <w:t>b. no                                                                    b. no</w:t>
-              <w:br/>
-              <w:br/>
-              <w:t>18. ESTRATO                                                   19. TIPO DE CONTRATO</w:t>
             </w:r>
           </w:p>
+          <w:tbl>
+            <w:tblPr>
+              <w:tblW w:type="auto" w:w="0"/>
+              <w:tblLook w:firstColumn="1" w:firstRow="1" w:lastColumn="0" w:lastRow="0" w:noHBand="0" w:noVBand="1" w:val="04A0"/>
+            </w:tblPr>
+            <w:tblGrid>
+              <w:gridCol w:w="720"/>
+              <w:gridCol w:w="720"/>
+            </w:tblGrid>
+            <w:tr>
+              <w:tc>
+                <w:tcPr>
+                  <w:tcW w:type="dxa" w:w="4649"/>
+                  <w:tcBorders>
+                    <w:top w:val="nil"/>
+                    <w:left w:val="nil"/>
+                    <w:bottom w:val="nil"/>
+                    <w:right w:val="nil"/>
+                  </w:tcBorders>
+                </w:tcPr>
+                <w:p>
+                  <w:pPr>
+                    <w:spacing w:after="80"/>
+                  </w:pPr>
+                  <w:r/>
+                  <w:r>
+                    <w:rPr>
+                      <w:b/>
+                      <w:sz w:val="20"/>
+                    </w:rPr>
+                    <w:t>1. EDAD</w:t>
+                  </w:r>
+                </w:p>
+                <w:p>
+                  <w:pPr>
+                    <w:spacing w:after="20" w:before="0"/>
+                  </w:pPr>
+                  <w:r>
+                    <w:rPr>
+                      <w:sz w:val="20"/>
+                    </w:rPr>
+                    <w:t>a. 18 – 25 años</w:t>
+                  </w:r>
+                </w:p>
+                <w:p>
+                  <w:pPr>
+                    <w:spacing w:after="20" w:before="0"/>
+                  </w:pPr>
+                  <w:r>
+                    <w:rPr>
+                      <w:sz w:val="20"/>
+                    </w:rPr>
+                    <w:t>b. 26 – 35 años</w:t>
+                  </w:r>
+                </w:p>
+                <w:p>
+                  <w:pPr>
+                    <w:spacing w:after="20" w:before="0"/>
+                  </w:pPr>
+                  <w:r>
+                    <w:rPr>
+                      <w:sz w:val="20"/>
+                    </w:rPr>
+                    <w:t>c. 36 – 45 años</w:t>
+                  </w:r>
+                </w:p>
+                <w:p>
+                  <w:pPr>
+                    <w:spacing w:after="20" w:before="0"/>
+                  </w:pPr>
+                  <w:r>
+                    <w:rPr>
+                      <w:sz w:val="20"/>
+                    </w:rPr>
+                    <w:t>d. 46 años o más</w:t>
+                  </w:r>
+                </w:p>
+              </w:tc>
+              <w:tc>
+                <w:tcPr>
+                  <w:tcW w:type="dxa" w:w="4649"/>
+                  <w:tcBorders>
+                    <w:top w:val="nil"/>
+                    <w:left w:val="nil"/>
+                    <w:bottom w:val="nil"/>
+                    <w:right w:val="nil"/>
+                  </w:tcBorders>
+                </w:tcPr>
+                <w:p>
+                  <w:pPr>
+                    <w:spacing w:after="80"/>
+                  </w:pPr>
+                  <w:r/>
+                  <w:r>
+                    <w:rPr>
+                      <w:b/>
+                      <w:sz w:val="20"/>
+                    </w:rPr>
+                    <w:t>2. ESTADO CIVIL</w:t>
+                  </w:r>
+                </w:p>
+                <w:p>
+                  <w:pPr>
+                    <w:spacing w:after="20" w:before="0"/>
+                  </w:pPr>
+                  <w:r>
+                    <w:rPr>
+                      <w:sz w:val="20"/>
+                    </w:rPr>
+                    <w:t>a. Soltero (a)</w:t>
+                  </w:r>
+                </w:p>
+                <w:p>
+                  <w:pPr>
+                    <w:spacing w:after="20" w:before="0"/>
+                  </w:pPr>
+                  <w:r>
+                    <w:rPr>
+                      <w:sz w:val="20"/>
+                    </w:rPr>
+                    <w:t>b. Unión libre</w:t>
+                  </w:r>
+                </w:p>
+                <w:p>
+                  <w:pPr>
+                    <w:spacing w:after="20" w:before="0"/>
+                  </w:pPr>
+                  <w:r>
+                    <w:rPr>
+                      <w:sz w:val="20"/>
+                    </w:rPr>
+                    <w:t>c. Casado (a)</w:t>
+                  </w:r>
+                </w:p>
+                <w:p>
+                  <w:pPr>
+                    <w:spacing w:after="20" w:before="0"/>
+                  </w:pPr>
+                  <w:r>
+                    <w:rPr>
+                      <w:sz w:val="20"/>
+                    </w:rPr>
+                    <w:t>d. Divorciado (a)</w:t>
+                  </w:r>
+                </w:p>
+              </w:tc>
+            </w:tr>
+            <w:tr>
+              <w:tc>
+                <w:tcPr>
+                  <w:tcW w:type="dxa" w:w="4649"/>
+                  <w:tcBorders>
+                    <w:top w:val="nil"/>
+                    <w:left w:val="nil"/>
+                    <w:bottom w:val="nil"/>
+                    <w:right w:val="nil"/>
+                  </w:tcBorders>
+                </w:tcPr>
+                <w:p>
+                  <w:pPr>
+                    <w:spacing w:after="80"/>
+                  </w:pPr>
+                  <w:r/>
+                  <w:r>
+                    <w:rPr>
+                      <w:b/>
+                      <w:sz w:val="20"/>
+                    </w:rPr>
+                    <w:t>3. SEXO</w:t>
+                  </w:r>
+                </w:p>
+                <w:p>
+                  <w:pPr>
+                    <w:spacing w:after="20" w:before="0"/>
+                  </w:pPr>
+                  <w:r>
+                    <w:rPr>
+                      <w:sz w:val="20"/>
+                    </w:rPr>
+                    <w:t>a. Hombre</w:t>
+                  </w:r>
+                </w:p>
+                <w:p>
+                  <w:pPr>
+                    <w:spacing w:after="20" w:before="0"/>
+                  </w:pPr>
+                  <w:r>
+                    <w:rPr>
+                      <w:sz w:val="20"/>
+                    </w:rPr>
+                    <w:t>b. Mujer</w:t>
+                  </w:r>
+                </w:p>
+                <w:p>
+                  <w:pPr>
+                    <w:spacing w:after="20" w:before="0"/>
+                  </w:pPr>
+                  <w:r>
+                    <w:rPr>
+                      <w:sz w:val="20"/>
+                    </w:rPr>
+                    <w:t>c. No binario</w:t>
+                  </w:r>
+                </w:p>
+              </w:tc>
+              <w:tc>
+                <w:tcPr>
+                  <w:tcW w:type="dxa" w:w="4649"/>
+                  <w:tcBorders>
+                    <w:top w:val="nil"/>
+                    <w:left w:val="nil"/>
+                    <w:bottom w:val="nil"/>
+                    <w:right w:val="nil"/>
+                  </w:tcBorders>
+                </w:tcPr>
+                <w:p>
+                  <w:pPr>
+                    <w:spacing w:after="80"/>
+                  </w:pPr>
+                  <w:r/>
+                  <w:r>
+                    <w:rPr>
+                      <w:b/>
+                      <w:sz w:val="20"/>
+                    </w:rPr>
+                    <w:t>4. NÚMERO DE PERSONAS A CARGO</w:t>
+                  </w:r>
+                </w:p>
+                <w:p>
+                  <w:pPr>
+                    <w:spacing w:after="20" w:before="0"/>
+                  </w:pPr>
+                  <w:r>
+                    <w:rPr>
+                      <w:sz w:val="20"/>
+                    </w:rPr>
+                    <w:t>a. Ninguna</w:t>
+                  </w:r>
+                </w:p>
+                <w:p>
+                  <w:pPr>
+                    <w:spacing w:after="20" w:before="0"/>
+                  </w:pPr>
+                  <w:r>
+                    <w:rPr>
+                      <w:sz w:val="20"/>
+                    </w:rPr>
+                    <w:t>b. 1 – 3 personas</w:t>
+                  </w:r>
+                </w:p>
+                <w:p>
+                  <w:pPr>
+                    <w:spacing w:after="20" w:before="0"/>
+                  </w:pPr>
+                  <w:r>
+                    <w:rPr>
+                      <w:sz w:val="20"/>
+                    </w:rPr>
+                    <w:t>c. 4 – 6 personas</w:t>
+                  </w:r>
+                </w:p>
+                <w:p>
+                  <w:pPr>
+                    <w:spacing w:after="20" w:before="0"/>
+                  </w:pPr>
+                  <w:r>
+                    <w:rPr>
+                      <w:sz w:val="20"/>
+                    </w:rPr>
+                    <w:t>d. Más de 6 personas</w:t>
+                  </w:r>
+                </w:p>
+              </w:tc>
+            </w:tr>
+            <w:tr>
+              <w:tc>
+                <w:tcPr>
+                  <w:tcW w:type="dxa" w:w="4649"/>
+                  <w:tcBorders>
+                    <w:top w:val="nil"/>
+                    <w:left w:val="nil"/>
+                    <w:bottom w:val="nil"/>
+                    <w:right w:val="nil"/>
+                  </w:tcBorders>
+                </w:tcPr>
+                <w:p>
+                  <w:pPr>
+                    <w:spacing w:after="80"/>
+                  </w:pPr>
+                  <w:r/>
+                  <w:r>
+                    <w:rPr>
+                      <w:b/>
+                      <w:sz w:val="20"/>
+                    </w:rPr>
+                    <w:t>5. NIVEL DE ESCOLARIDAD</w:t>
+                  </w:r>
+                </w:p>
+                <w:p>
+                  <w:pPr>
+                    <w:spacing w:after="20" w:before="0"/>
+                  </w:pPr>
+                  <w:r>
+                    <w:rPr>
+                      <w:sz w:val="20"/>
+                    </w:rPr>
+                    <w:t>a. Primaria</w:t>
+                  </w:r>
+                </w:p>
+                <w:p>
+                  <w:pPr>
+                    <w:spacing w:after="20" w:before="0"/>
+                  </w:pPr>
+                  <w:r>
+                    <w:rPr>
+                      <w:sz w:val="20"/>
+                    </w:rPr>
+                    <w:t>b. Secundaria</w:t>
+                  </w:r>
+                </w:p>
+                <w:p>
+                  <w:pPr>
+                    <w:spacing w:after="20" w:before="0"/>
+                  </w:pPr>
+                  <w:r>
+                    <w:rPr>
+                      <w:sz w:val="20"/>
+                    </w:rPr>
+                    <w:t>c. Técnico / Tecnólogo</w:t>
+                  </w:r>
+                </w:p>
+                <w:p>
+                  <w:pPr>
+                    <w:spacing w:after="20" w:before="0"/>
+                  </w:pPr>
+                  <w:r>
+                    <w:rPr>
+                      <w:sz w:val="20"/>
+                    </w:rPr>
+                    <w:t>d. Universitario</w:t>
+                  </w:r>
+                </w:p>
+                <w:p>
+                  <w:pPr>
+                    <w:spacing w:after="20" w:before="0"/>
+                  </w:pPr>
+                  <w:r>
+                    <w:rPr>
+                      <w:sz w:val="20"/>
+                    </w:rPr>
+                    <w:t>e. Ninguna</w:t>
+                  </w:r>
+                </w:p>
+              </w:tc>
+              <w:tc>
+                <w:tcPr>
+                  <w:tcW w:type="dxa" w:w="4649"/>
+                  <w:tcBorders>
+                    <w:top w:val="nil"/>
+                    <w:left w:val="nil"/>
+                    <w:bottom w:val="nil"/>
+                    <w:right w:val="nil"/>
+                  </w:tcBorders>
+                </w:tcPr>
+                <w:p>
+                  <w:pPr>
+                    <w:spacing w:after="80"/>
+                  </w:pPr>
+                  <w:r/>
+                  <w:r>
+                    <w:rPr>
+                      <w:b/>
+                      <w:sz w:val="20"/>
+                    </w:rPr>
+                    <w:t>6. TENENCIA DE VIVIENDA</w:t>
+                  </w:r>
+                </w:p>
+                <w:p>
+                  <w:pPr>
+                    <w:spacing w:after="20" w:before="0"/>
+                  </w:pPr>
+                  <w:r>
+                    <w:rPr>
+                      <w:sz w:val="20"/>
+                    </w:rPr>
+                    <w:t>a. Propia</w:t>
+                  </w:r>
+                </w:p>
+                <w:p>
+                  <w:pPr>
+                    <w:spacing w:after="20" w:before="0"/>
+                  </w:pPr>
+                  <w:r>
+                    <w:rPr>
+                      <w:sz w:val="20"/>
+                    </w:rPr>
+                    <w:t>b. Arrendada</w:t>
+                  </w:r>
+                </w:p>
+                <w:p>
+                  <w:pPr>
+                    <w:spacing w:after="20" w:before="0"/>
+                  </w:pPr>
+                  <w:r>
+                    <w:rPr>
+                      <w:sz w:val="20"/>
+                    </w:rPr>
+                    <w:t>c. Familiar</w:t>
+                  </w:r>
+                </w:p>
+                <w:p>
+                  <w:pPr>
+                    <w:spacing w:after="20" w:before="0"/>
+                  </w:pPr>
+                  <w:r>
+                    <w:rPr>
+                      <w:sz w:val="20"/>
+                    </w:rPr>
+                    <w:t>d. Compartida con otra(s) familia(s)</w:t>
+                  </w:r>
+                </w:p>
+              </w:tc>
+            </w:tr>
+            <w:tr>
+              <w:tc>
+                <w:tcPr>
+                  <w:tcW w:type="dxa" w:w="4649"/>
+                  <w:tcBorders>
+                    <w:top w:val="nil"/>
+                    <w:left w:val="nil"/>
+                    <w:bottom w:val="nil"/>
+                    <w:right w:val="nil"/>
+                  </w:tcBorders>
+                </w:tcPr>
+                <w:p>
+                  <w:pPr>
+                    <w:spacing w:after="80"/>
+                  </w:pPr>
+                  <w:r/>
+                  <w:r>
+                    <w:rPr>
+                      <w:b/>
+                      <w:sz w:val="20"/>
+                    </w:rPr>
+                    <w:t>7. USO DEL TIEMPO LIBRE</w:t>
+                  </w:r>
+                </w:p>
+                <w:p>
+                  <w:pPr>
+                    <w:spacing w:after="20" w:before="0"/>
+                  </w:pPr>
+                  <w:r>
+                    <w:rPr>
+                      <w:sz w:val="20"/>
+                    </w:rPr>
+                    <w:t>a. Otro trabajo</w:t>
+                  </w:r>
+                </w:p>
+                <w:p>
+                  <w:pPr>
+                    <w:spacing w:after="20" w:before="0"/>
+                  </w:pPr>
+                  <w:r>
+                    <w:rPr>
+                      <w:sz w:val="20"/>
+                    </w:rPr>
+                    <w:t>b. Labores domésticas</w:t>
+                  </w:r>
+                </w:p>
+                <w:p>
+                  <w:pPr>
+                    <w:spacing w:after="20" w:before="0"/>
+                  </w:pPr>
+                  <w:r>
+                    <w:rPr>
+                      <w:sz w:val="20"/>
+                    </w:rPr>
+                    <w:t>c. Recreación y deporte</w:t>
+                  </w:r>
+                </w:p>
+                <w:p>
+                  <w:pPr>
+                    <w:spacing w:after="20" w:before="0"/>
+                  </w:pPr>
+                  <w:r>
+                    <w:rPr>
+                      <w:sz w:val="20"/>
+                    </w:rPr>
+                    <w:t>d. Estudio</w:t>
+                  </w:r>
+                </w:p>
+                <w:p>
+                  <w:pPr>
+                    <w:spacing w:after="20" w:before="0"/>
+                  </w:pPr>
+                  <w:r>
+                    <w:rPr>
+                      <w:sz w:val="20"/>
+                    </w:rPr>
+                    <w:t>e. Ninguno</w:t>
+                  </w:r>
+                </w:p>
+              </w:tc>
+              <w:tc>
+                <w:tcPr>
+                  <w:tcW w:type="dxa" w:w="4649"/>
+                  <w:tcBorders>
+                    <w:top w:val="nil"/>
+                    <w:left w:val="nil"/>
+                    <w:bottom w:val="nil"/>
+                    <w:right w:val="nil"/>
+                  </w:tcBorders>
+                </w:tcPr>
+                <w:p>
+                  <w:pPr>
+                    <w:spacing w:after="80"/>
+                  </w:pPr>
+                  <w:r/>
+                  <w:r>
+                    <w:rPr>
+                      <w:b/>
+                      <w:sz w:val="20"/>
+                    </w:rPr>
+                    <w:t>8. PROMEDIO DE INGRESOS (S.M.L.)</w:t>
+                  </w:r>
+                </w:p>
+                <w:p>
+                  <w:pPr>
+                    <w:spacing w:after="20" w:before="0"/>
+                  </w:pPr>
+                  <w:r>
+                    <w:rPr>
+                      <w:sz w:val="20"/>
+                    </w:rPr>
+                    <w:t>a. Mínimo Legal (S.M.L.)</w:t>
+                  </w:r>
+                </w:p>
+                <w:p>
+                  <w:pPr>
+                    <w:spacing w:after="20" w:before="0"/>
+                  </w:pPr>
+                  <w:r>
+                    <w:rPr>
+                      <w:sz w:val="20"/>
+                    </w:rPr>
+                    <w:t>b. Entre 1 a 2 S.M.L.</w:t>
+                  </w:r>
+                </w:p>
+                <w:p>
+                  <w:pPr>
+                    <w:spacing w:after="20" w:before="0"/>
+                  </w:pPr>
+                  <w:r>
+                    <w:rPr>
+                      <w:sz w:val="20"/>
+                    </w:rPr>
+                    <w:t>c. Entre 3 a 4 S.M.L.</w:t>
+                  </w:r>
+                </w:p>
+                <w:p>
+                  <w:pPr>
+                    <w:spacing w:after="20" w:before="0"/>
+                  </w:pPr>
+                  <w:r>
+                    <w:rPr>
+                      <w:sz w:val="20"/>
+                    </w:rPr>
+                    <w:t>d. Más de 5 S.M.L.</w:t>
+                  </w:r>
+                </w:p>
+              </w:tc>
+            </w:tr>
+            <w:tr>
+              <w:tc>
+                <w:tcPr>
+                  <w:tcW w:type="dxa" w:w="4649"/>
+                  <w:tcBorders>
+                    <w:top w:val="nil"/>
+                    <w:left w:val="nil"/>
+                    <w:bottom w:val="nil"/>
+                    <w:right w:val="nil"/>
+                  </w:tcBorders>
+                </w:tcPr>
+                <w:p>
+                  <w:pPr>
+                    <w:spacing w:after="80"/>
+                  </w:pPr>
+                  <w:r/>
+                  <w:r>
+                    <w:rPr>
+                      <w:b/>
+                      <w:sz w:val="20"/>
+                    </w:rPr>
+                    <w:t>9. ANTIGÜEDAD EN LA EMPRESA</w:t>
+                  </w:r>
+                </w:p>
+                <w:p>
+                  <w:pPr>
+                    <w:spacing w:after="20" w:before="0"/>
+                  </w:pPr>
+                  <w:r>
+                    <w:rPr>
+                      <w:sz w:val="20"/>
+                    </w:rPr>
+                    <w:t>a. Menos de 1 mes</w:t>
+                  </w:r>
+                </w:p>
+                <w:p>
+                  <w:pPr>
+                    <w:spacing w:after="20" w:before="0"/>
+                  </w:pPr>
+                  <w:r>
+                    <w:rPr>
+                      <w:sz w:val="20"/>
+                    </w:rPr>
+                    <w:t>b. De 1 a 6 meses</w:t>
+                  </w:r>
+                </w:p>
+                <w:p>
+                  <w:pPr>
+                    <w:spacing w:after="20" w:before="0"/>
+                  </w:pPr>
+                  <w:r>
+                    <w:rPr>
+                      <w:sz w:val="20"/>
+                    </w:rPr>
+                    <w:t>c. De 7 a 11 meses</w:t>
+                  </w:r>
+                </w:p>
+                <w:p>
+                  <w:pPr>
+                    <w:spacing w:after="20" w:before="0"/>
+                  </w:pPr>
+                  <w:r>
+                    <w:rPr>
+                      <w:sz w:val="20"/>
+                    </w:rPr>
+                    <w:t>d. De 1 a 2 años</w:t>
+                  </w:r>
+                </w:p>
+                <w:p>
+                  <w:pPr>
+                    <w:spacing w:after="20" w:before="0"/>
+                  </w:pPr>
+                  <w:r>
+                    <w:rPr>
+                      <w:sz w:val="20"/>
+                    </w:rPr>
+                    <w:t>e. Más de 2 años</w:t>
+                  </w:r>
+                </w:p>
+              </w:tc>
+              <w:tc>
+                <w:tcPr>
+                  <w:tcW w:type="dxa" w:w="4649"/>
+                  <w:tcBorders>
+                    <w:top w:val="nil"/>
+                    <w:left w:val="nil"/>
+                    <w:bottom w:val="nil"/>
+                    <w:right w:val="nil"/>
+                  </w:tcBorders>
+                </w:tcPr>
+                <w:p>
+                  <w:pPr>
+                    <w:spacing w:after="80"/>
+                  </w:pPr>
+                  <w:r/>
+                  <w:r>
+                    <w:rPr>
+                      <w:b/>
+                      <w:sz w:val="20"/>
+                    </w:rPr>
+                    <w:t>10. ANTIGÜEDAD EN EL CARGO ACTUAL</w:t>
+                  </w:r>
+                </w:p>
+                <w:p>
+                  <w:pPr>
+                    <w:spacing w:after="20" w:before="0"/>
+                  </w:pPr>
+                  <w:r>
+                    <w:rPr>
+                      <w:sz w:val="20"/>
+                    </w:rPr>
+                    <w:t>a. Menos de 1 mes</w:t>
+                  </w:r>
+                </w:p>
+                <w:p>
+                  <w:pPr>
+                    <w:spacing w:after="20" w:before="0"/>
+                  </w:pPr>
+                  <w:r>
+                    <w:rPr>
+                      <w:sz w:val="20"/>
+                    </w:rPr>
+                    <w:t>b. De 1 a 6 meses</w:t>
+                  </w:r>
+                </w:p>
+                <w:p>
+                  <w:pPr>
+                    <w:spacing w:after="20" w:before="0"/>
+                  </w:pPr>
+                  <w:r>
+                    <w:rPr>
+                      <w:sz w:val="20"/>
+                    </w:rPr>
+                    <w:t>c. De 7 a 11 meses</w:t>
+                  </w:r>
+                </w:p>
+                <w:p>
+                  <w:pPr>
+                    <w:spacing w:after="20" w:before="0"/>
+                  </w:pPr>
+                  <w:r>
+                    <w:rPr>
+                      <w:sz w:val="20"/>
+                    </w:rPr>
+                    <w:t>d. De 1 a 2 años</w:t>
+                  </w:r>
+                </w:p>
+                <w:p>
+                  <w:pPr>
+                    <w:spacing w:after="20" w:before="0"/>
+                  </w:pPr>
+                  <w:r>
+                    <w:rPr>
+                      <w:sz w:val="20"/>
+                    </w:rPr>
+                    <w:t>e. Más de 2 años</w:t>
+                  </w:r>
+                </w:p>
+              </w:tc>
+            </w:tr>
+            <w:tr>
+              <w:tc>
+                <w:tcPr>
+                  <w:tcW w:type="dxa" w:w="4649"/>
+                  <w:tcBorders>
+                    <w:top w:val="nil"/>
+                    <w:left w:val="nil"/>
+                    <w:bottom w:val="nil"/>
+                    <w:right w:val="nil"/>
+                  </w:tcBorders>
+                </w:tcPr>
+                <w:p>
+                  <w:pPr>
+                    <w:spacing w:after="80"/>
+                  </w:pPr>
+                  <w:r/>
+                  <w:r>
+                    <w:rPr>
+                      <w:b/>
+                      <w:sz w:val="20"/>
+                    </w:rPr>
+                    <w:t>11. HA PARTICIPADO EN ACTIVIDADES DE SALUD REALIZADAS POR LA EMPRESA</w:t>
+                  </w:r>
+                </w:p>
+                <w:p>
+                  <w:pPr>
+                    <w:spacing w:after="20" w:before="0"/>
+                  </w:pPr>
+                  <w:r>
+                    <w:rPr>
+                      <w:sz w:val="20"/>
+                    </w:rPr>
+                    <w:t>a. Vacunación</w:t>
+                  </w:r>
+                </w:p>
+                <w:p>
+                  <w:pPr>
+                    <w:spacing w:after="20" w:before="0"/>
+                  </w:pPr>
+                  <w:r>
+                    <w:rPr>
+                      <w:sz w:val="20"/>
+                    </w:rPr>
+                    <w:t>b. Salud Oral</w:t>
+                  </w:r>
+                </w:p>
+                <w:p>
+                  <w:pPr>
+                    <w:spacing w:after="20" w:before="0"/>
+                  </w:pPr>
+                  <w:r>
+                    <w:rPr>
+                      <w:sz w:val="20"/>
+                    </w:rPr>
+                    <w:t>c. Exámenes de laboratorio y otros</w:t>
+                  </w:r>
+                </w:p>
+                <w:p>
+                  <w:pPr>
+                    <w:spacing w:after="20" w:before="0"/>
+                  </w:pPr>
+                  <w:r>
+                    <w:rPr>
+                      <w:sz w:val="20"/>
+                    </w:rPr>
+                    <w:t>d. Exámenes médicos anuales</w:t>
+                  </w:r>
+                </w:p>
+                <w:p>
+                  <w:pPr>
+                    <w:spacing w:after="20" w:before="0"/>
+                  </w:pPr>
+                  <w:r>
+                    <w:rPr>
+                      <w:sz w:val="20"/>
+                    </w:rPr>
+                    <w:t>e. Ninguna</w:t>
+                  </w:r>
+                </w:p>
+              </w:tc>
+              <w:tc>
+                <w:tcPr>
+                  <w:tcW w:type="dxa" w:w="4649"/>
+                  <w:tcBorders>
+                    <w:top w:val="nil"/>
+                    <w:left w:val="nil"/>
+                    <w:bottom w:val="nil"/>
+                    <w:right w:val="nil"/>
+                  </w:tcBorders>
+                </w:tcPr>
+                <w:p>
+                  <w:pPr>
+                    <w:spacing w:after="80"/>
+                  </w:pPr>
+                  <w:r/>
+                  <w:r>
+                    <w:rPr>
+                      <w:b/>
+                      <w:sz w:val="20"/>
+                    </w:rPr>
+                    <w:t>12. LE HAN DIAGNOSTICADO ALGUNA ENFERMEDAD</w:t>
+                  </w:r>
+                </w:p>
+                <w:p>
+                  <w:pPr>
+                    <w:spacing w:after="20" w:before="0"/>
+                  </w:pPr>
+                  <w:r>
+                    <w:rPr>
+                      <w:sz w:val="20"/>
+                    </w:rPr>
+                    <w:t>a. Sí</w:t>
+                  </w:r>
+                </w:p>
+                <w:p>
+                  <w:pPr>
+                    <w:spacing w:after="20" w:before="0"/>
+                  </w:pPr>
+                  <w:r>
+                    <w:rPr>
+                      <w:sz w:val="20"/>
+                    </w:rPr>
+                    <w:t>b. No</w:t>
+                  </w:r>
+                </w:p>
+                <w:p>
+                  <w:pPr>
+                    <w:spacing w:after="20" w:before="0"/>
+                  </w:pPr>
+                  <w:r>
+                    <w:rPr>
+                      <w:sz w:val="20"/>
+                    </w:rPr>
+                    <w:t>Cuál: _______________________________</w:t>
+                  </w:r>
+                </w:p>
+              </w:tc>
+            </w:tr>
+            <w:tr>
+              <w:tc>
+                <w:tcPr>
+                  <w:tcW w:type="dxa" w:w="4649"/>
+                  <w:tcBorders>
+                    <w:top w:val="nil"/>
+                    <w:left w:val="nil"/>
+                    <w:bottom w:val="nil"/>
+                    <w:right w:val="nil"/>
+                  </w:tcBorders>
+                </w:tcPr>
+                <w:p>
+                  <w:pPr>
+                    <w:spacing w:after="80"/>
+                  </w:pPr>
+                  <w:r/>
+                  <w:r>
+                    <w:rPr>
+                      <w:b/>
+                      <w:sz w:val="20"/>
+                    </w:rPr>
+                    <w:t>13. CONSUME BEBIDAS ALCOHÓLICAS</w:t>
+                  </w:r>
+                </w:p>
+                <w:p>
+                  <w:pPr>
+                    <w:spacing w:after="20" w:before="0"/>
+                  </w:pPr>
+                  <w:r>
+                    <w:rPr>
+                      <w:sz w:val="20"/>
+                    </w:rPr>
+                    <w:t>a. Sí</w:t>
+                  </w:r>
+                </w:p>
+                <w:p>
+                  <w:pPr>
+                    <w:spacing w:after="20" w:before="0"/>
+                  </w:pPr>
+                  <w:r>
+                    <w:rPr>
+                      <w:sz w:val="20"/>
+                    </w:rPr>
+                    <w:t>b. No</w:t>
+                  </w:r>
+                </w:p>
+                <w:p>
+                  <w:pPr>
+                    <w:spacing w:after="20" w:before="0"/>
+                  </w:pPr>
+                  <w:r>
+                    <w:rPr>
+                      <w:sz w:val="20"/>
+                    </w:rPr>
+                    <w:t>Frecuencia: _________________________</w:t>
+                  </w:r>
+                </w:p>
+              </w:tc>
+              <w:tc>
+                <w:tcPr>
+                  <w:tcW w:type="dxa" w:w="4649"/>
+                  <w:tcBorders>
+                    <w:top w:val="nil"/>
+                    <w:left w:val="nil"/>
+                    <w:bottom w:val="nil"/>
+                    <w:right w:val="nil"/>
+                  </w:tcBorders>
+                </w:tcPr>
+                <w:p>
+                  <w:pPr>
+                    <w:spacing w:after="80"/>
+                  </w:pPr>
+                  <w:r/>
+                  <w:r>
+                    <w:rPr>
+                      <w:b/>
+                      <w:sz w:val="20"/>
+                    </w:rPr>
+                    <w:t>14. PRACTICA ALGÚN DEPORTE</w:t>
+                  </w:r>
+                </w:p>
+                <w:p>
+                  <w:pPr>
+                    <w:spacing w:after="20" w:before="0"/>
+                  </w:pPr>
+                  <w:r>
+                    <w:rPr>
+                      <w:sz w:val="20"/>
+                    </w:rPr>
+                    <w:t>___ Semanal</w:t>
+                  </w:r>
+                </w:p>
+                <w:p>
+                  <w:pPr>
+                    <w:spacing w:after="20" w:before="0"/>
+                  </w:pPr>
+                  <w:r>
+                    <w:rPr>
+                      <w:sz w:val="20"/>
+                    </w:rPr>
+                    <w:t>___ Quincenal</w:t>
+                  </w:r>
+                </w:p>
+                <w:p>
+                  <w:pPr>
+                    <w:spacing w:after="20" w:before="0"/>
+                  </w:pPr>
+                  <w:r>
+                    <w:rPr>
+                      <w:sz w:val="20"/>
+                    </w:rPr>
+                    <w:t>___ Mensual</w:t>
+                  </w:r>
+                </w:p>
+                <w:p>
+                  <w:pPr>
+                    <w:spacing w:after="20" w:before="0"/>
+                  </w:pPr>
+                  <w:r>
+                    <w:rPr>
+                      <w:sz w:val="20"/>
+                    </w:rPr>
+                    <w:t>___ Ocasional</w:t>
+                  </w:r>
+                </w:p>
+                <w:p>
+                  <w:pPr>
+                    <w:spacing w:after="20" w:before="0"/>
+                  </w:pPr>
+                  <w:r>
+                    <w:rPr>
+                      <w:sz w:val="20"/>
+                    </w:rPr>
+                    <w:t>Cuál: _______________________________</w:t>
+                  </w:r>
+                </w:p>
+              </w:tc>
+            </w:tr>
+            <w:tr>
+              <w:tc>
+                <w:tcPr>
+                  <w:tcW w:type="dxa" w:w="4649"/>
+                  <w:tcBorders>
+                    <w:top w:val="nil"/>
+                    <w:left w:val="nil"/>
+                    <w:bottom w:val="nil"/>
+                    <w:right w:val="nil"/>
+                  </w:tcBorders>
+                </w:tcPr>
+                <w:p>
+                  <w:pPr>
+                    <w:spacing w:after="80"/>
+                  </w:pPr>
+                  <w:r/>
+                  <w:r>
+                    <w:rPr>
+                      <w:b/>
+                      <w:sz w:val="20"/>
+                    </w:rPr>
+                    <w:t>15. FUMA</w:t>
+                  </w:r>
+                </w:p>
+                <w:p>
+                  <w:pPr>
+                    <w:spacing w:after="20" w:before="0"/>
+                  </w:pPr>
+                  <w:r>
+                    <w:rPr>
+                      <w:sz w:val="20"/>
+                    </w:rPr>
+                    <w:t>a. Sí</w:t>
+                  </w:r>
+                </w:p>
+                <w:p>
+                  <w:pPr>
+                    <w:spacing w:after="20" w:before="0"/>
+                  </w:pPr>
+                  <w:r>
+                    <w:rPr>
+                      <w:sz w:val="20"/>
+                    </w:rPr>
+                    <w:t>b. No</w:t>
+                  </w:r>
+                </w:p>
+                <w:p>
+                  <w:pPr>
+                    <w:spacing w:after="20" w:before="0"/>
+                  </w:pPr>
+                  <w:r>
+                    <w:rPr>
+                      <w:sz w:val="20"/>
+                    </w:rPr>
+                    <w:t>Promedio: ____________________________</w:t>
+                  </w:r>
+                </w:p>
+              </w:tc>
+              <w:tc>
+                <w:tcPr>
+                  <w:tcW w:type="dxa" w:w="4649"/>
+                  <w:tcBorders>
+                    <w:top w:val="nil"/>
+                    <w:left w:val="nil"/>
+                    <w:bottom w:val="nil"/>
+                    <w:right w:val="nil"/>
+                  </w:tcBorders>
+                </w:tcPr>
+                <w:p>
+                  <w:pPr>
+                    <w:spacing w:after="80"/>
+                  </w:pPr>
+                  <w:r/>
+                  <w:r>
+                    <w:rPr>
+                      <w:b/>
+                      <w:sz w:val="20"/>
+                    </w:rPr>
+                    <w:t>16. CONSUME SUSTANCIAS TÓXICAS</w:t>
+                  </w:r>
+                </w:p>
+                <w:p>
+                  <w:pPr>
+                    <w:spacing w:after="20" w:before="0"/>
+                  </w:pPr>
+                  <w:r>
+                    <w:rPr>
+                      <w:sz w:val="20"/>
+                    </w:rPr>
+                    <w:t>a. Sí</w:t>
+                  </w:r>
+                </w:p>
+                <w:p>
+                  <w:pPr>
+                    <w:spacing w:after="20" w:before="0"/>
+                  </w:pPr>
+                  <w:r>
+                    <w:rPr>
+                      <w:sz w:val="20"/>
+                    </w:rPr>
+                    <w:t>b. No</w:t>
+                  </w:r>
+                </w:p>
+              </w:tc>
+            </w:tr>
+            <w:tr>
+              <w:tc>
+                <w:tcPr>
+                  <w:tcW w:type="dxa" w:w="4649"/>
+                  <w:tcBorders>
+                    <w:top w:val="nil"/>
+                    <w:left w:val="nil"/>
+                    <w:bottom w:val="nil"/>
+                    <w:right w:val="nil"/>
+                  </w:tcBorders>
+                </w:tcPr>
+                <w:p>
+                  <w:pPr>
+                    <w:spacing w:after="80"/>
+                  </w:pPr>
+                  <w:r/>
+                  <w:r>
+                    <w:rPr>
+                      <w:b/>
+                      <w:sz w:val="20"/>
+                    </w:rPr>
+                    <w:t>17. CONSUME MEDICAMENTOS</w:t>
+                  </w:r>
+                </w:p>
+                <w:p>
+                  <w:pPr>
+                    <w:spacing w:after="20" w:before="0"/>
+                  </w:pPr>
+                  <w:r>
+                    <w:rPr>
+                      <w:sz w:val="20"/>
+                    </w:rPr>
+                    <w:t>a. Sí</w:t>
+                  </w:r>
+                </w:p>
+                <w:p>
+                  <w:pPr>
+                    <w:spacing w:after="20" w:before="0"/>
+                  </w:pPr>
+                  <w:r>
+                    <w:rPr>
+                      <w:sz w:val="20"/>
+                    </w:rPr>
+                    <w:t>b. No</w:t>
+                  </w:r>
+                </w:p>
+              </w:tc>
+              <w:tc>
+                <w:tcPr>
+                  <w:tcW w:type="dxa" w:w="4649"/>
+                  <w:tcBorders>
+                    <w:top w:val="nil"/>
+                    <w:left w:val="nil"/>
+                    <w:bottom w:val="nil"/>
+                    <w:right w:val="nil"/>
+                  </w:tcBorders>
+                </w:tcPr>
+                <w:p>
+                  <w:pPr>
+                    <w:spacing w:after="80"/>
+                  </w:pPr>
+                  <w:r/>
+                  <w:r>
+                    <w:rPr>
+                      <w:b/>
+                      <w:sz w:val="20"/>
+                    </w:rPr>
+                    <w:t>18. ESTRATO</w:t>
+                  </w:r>
+                </w:p>
+                <w:p>
+                  <w:pPr>
+                    <w:spacing w:after="20" w:before="0"/>
+                  </w:pPr>
+                  <w:r>
+                    <w:rPr>
+                      <w:sz w:val="20"/>
+                    </w:rPr>
+                    <w:t>a. 1</w:t>
+                  </w:r>
+                </w:p>
+                <w:p>
+                  <w:pPr>
+                    <w:spacing w:after="20" w:before="0"/>
+                  </w:pPr>
+                  <w:r>
+                    <w:rPr>
+                      <w:sz w:val="20"/>
+                    </w:rPr>
+                    <w:t>b. 2</w:t>
+                  </w:r>
+                </w:p>
+                <w:p>
+                  <w:pPr>
+                    <w:spacing w:after="20" w:before="0"/>
+                  </w:pPr>
+                  <w:r>
+                    <w:rPr>
+                      <w:sz w:val="20"/>
+                    </w:rPr>
+                    <w:t>c. 3</w:t>
+                  </w:r>
+                </w:p>
+                <w:p>
+                  <w:pPr>
+                    <w:spacing w:after="20" w:before="0"/>
+                  </w:pPr>
+                  <w:r>
+                    <w:rPr>
+                      <w:sz w:val="20"/>
+                    </w:rPr>
+                    <w:t>d. 4</w:t>
+                  </w:r>
+                </w:p>
+                <w:p>
+                  <w:pPr>
+                    <w:spacing w:after="20" w:before="0"/>
+                  </w:pPr>
+                  <w:r>
+                    <w:rPr>
+                      <w:sz w:val="20"/>
+                    </w:rPr>
+                    <w:t>e. 5</w:t>
+                  </w:r>
+                </w:p>
+                <w:p>
+                  <w:pPr>
+                    <w:spacing w:after="20" w:before="0"/>
+                  </w:pPr>
+                  <w:r>
+                    <w:rPr>
+                      <w:sz w:val="20"/>
+                    </w:rPr>
+                    <w:t>f. 6</w:t>
+                  </w:r>
+                </w:p>
+              </w:tc>
+            </w:tr>
+            <w:tr>
+              <w:tc>
+                <w:tcPr>
+                  <w:tcW w:type="dxa" w:w="4649"/>
+                  <w:tcBorders>
+                    <w:top w:val="nil"/>
+                    <w:left w:val="nil"/>
+                    <w:bottom w:val="nil"/>
+                    <w:right w:val="nil"/>
+                  </w:tcBorders>
+                </w:tcPr>
+                <w:p>
+                  <w:pPr>
+                    <w:spacing w:after="80"/>
+                  </w:pPr>
+                  <w:r/>
+                  <w:r>
+                    <w:rPr>
+                      <w:b/>
+                      <w:sz w:val="20"/>
+                    </w:rPr>
+                    <w:t>19. TIPO DE CONTRATO</w:t>
+                  </w:r>
+                </w:p>
+                <w:p>
+                  <w:pPr>
+                    <w:spacing w:after="20" w:before="0"/>
+                  </w:pPr>
+                  <w:r>
+                    <w:rPr>
+                      <w:sz w:val="20"/>
+                    </w:rPr>
+                    <w:t>a. Término indefinido</w:t>
+                  </w:r>
+                </w:p>
+                <w:p>
+                  <w:pPr>
+                    <w:spacing w:after="20" w:before="0"/>
+                  </w:pPr>
+                  <w:r>
+                    <w:rPr>
+                      <w:sz w:val="20"/>
+                    </w:rPr>
+                    <w:t>b. Término fijo</w:t>
+                  </w:r>
+                </w:p>
+                <w:p>
+                  <w:pPr>
+                    <w:spacing w:after="20" w:before="0"/>
+                  </w:pPr>
+                  <w:r>
+                    <w:rPr>
+                      <w:sz w:val="20"/>
+                    </w:rPr>
+                    <w:t>c. Obra o labor</w:t>
+                  </w:r>
+                </w:p>
+                <w:p>
+                  <w:pPr>
+                    <w:spacing w:after="20" w:before="0"/>
+                  </w:pPr>
+                  <w:r>
+                    <w:rPr>
+                      <w:sz w:val="20"/>
+                    </w:rPr>
+                    <w:t>d. Prestación de servicios</w:t>
+                  </w:r>
+                </w:p>
+                <w:p>
+                  <w:pPr>
+                    <w:spacing w:after="20" w:before="0"/>
+                  </w:pPr>
+                  <w:r>
+                    <w:rPr>
+                      <w:sz w:val="20"/>
+                    </w:rPr>
+                    <w:t>e. Otro: ________________</w:t>
+                  </w:r>
+                </w:p>
+              </w:tc>
+              <w:tc>
+                <w:tcPr>
+                  <w:tcW w:type="dxa" w:w="4649"/>
+                  <w:tcBorders>
+                    <w:top w:val="nil"/>
+                    <w:left w:val="nil"/>
+                    <w:bottom w:val="nil"/>
+                    <w:right w:val="nil"/>
+                  </w:tcBorders>
+                </w:tcPr>
+                <w:p>
+                  <w:r/>
+                </w:p>
+              </w:tc>
+            </w:tr>
+          </w:tbl>
+          <w:p/>
         </w:tc>
       </w:tr>
       <w:tr>

</xml_diff>